<commit_message>
fix: ajustar entidad en tabla de asistentes del acta
Usa SUMIMEDICAL sin sufijo para evitar salto de línea incorrecto
en la columna ENTIDAD de la plantilla V3.

Co-authored-by: edilsonandres01-hub <edilsonandres01-hub@users.noreply.github.com>
</commit_message>
<xml_diff>
--- a/documentos/FO-PD-003_ACTA_DE_REUNION_03SEP2026.docx
+++ b/documentos/FO-PD-003_ACTA_DE_REUNION_03SEP2026.docx
@@ -613,7 +613,7 @@
                 <w:b w:val="0"/>
                 <w:sz w:val="22"/>
               </w:rPr>
-              <w:t>SUMIMEDICAL S.A.S</w:t>
+              <w:t>SUMIMEDICAL</w:t>
             </w:r>
           </w:p>
         </w:tc>
@@ -749,7 +749,7 @@
                 <w:b w:val="0"/>
                 <w:sz w:val="22"/>
               </w:rPr>
-              <w:t>SUMIMEDICAL S.A.S</w:t>
+              <w:t>SUMIMEDICAL</w:t>
             </w:r>
           </w:p>
         </w:tc>

</xml_diff>

<commit_message>
fix: ensanchar columna ENTIDAD en tabla de asistentes
Ajusta anchos de columna y tamaño de fuente para que
SUMIMEDICAL quepa sin partirse incorrectamente.

Co-authored-by: edilsonandres01-hub <edilsonandres01-hub@users.noreply.github.com>
</commit_message>
<xml_diff>
--- a/documentos/FO-PD-003_ACTA_DE_REUNION_03SEP2026.docx
+++ b/documentos/FO-PD-003_ACTA_DE_REUNION_03SEP2026.docx
@@ -314,9 +314,9 @@
       </w:tblPr>
       <w:tblGrid>
         <w:gridCol w:w="3921"/>
-        <w:gridCol w:w="2268"/>
-        <w:gridCol w:w="1701"/>
-        <w:gridCol w:w="2410"/>
+        <w:gridCol w:w="2100"/>
+        <w:gridCol w:w="2200"/>
+        <w:gridCol w:w="2079"/>
       </w:tblGrid>
       <w:tr>
         <w:trPr>
@@ -361,7 +361,7 @@
         </w:tc>
         <w:tc>
           <w:tcPr>
-            <w:tcW w:w="2268" w:type="dxa"/>
+            <w:tcW w:w="2100" w:type="dxa"/>
             <w:tcBorders>
               <w:top w:val="single" w:sz="4" w:space="0" w:color="000000"/>
               <w:start w:val="single" w:sz="4" w:space="0" w:color="000000"/>
@@ -392,7 +392,7 @@
         </w:tc>
         <w:tc>
           <w:tcPr>
-            <w:tcW w:w="1701" w:type="dxa"/>
+            <w:tcW w:w="2200" w:type="dxa"/>
             <w:tcBorders>
               <w:top w:val="single" w:sz="4" w:space="0" w:color="000000"/>
               <w:start w:val="single" w:sz="4" w:space="0" w:color="000000"/>
@@ -429,7 +429,7 @@
         </w:tc>
         <w:tc>
           <w:tcPr>
-            <w:tcW w:w="2410" w:type="dxa"/>
+            <w:tcW w:w="2079" w:type="dxa"/>
             <w:tcBorders>
               <w:top w:val="single" w:sz="4" w:space="0" w:color="000000"/>
               <w:start w:val="single" w:sz="4" w:space="0" w:color="000000"/>
@@ -553,7 +553,7 @@
         </w:tc>
         <w:tc>
           <w:tcPr>
-            <w:tcW w:w="2268" w:type="dxa"/>
+            <w:tcW w:w="2100" w:type="dxa"/>
             <w:tcBorders>
               <w:top w:val="single" w:sz="4" w:space="0" w:color="000000"/>
               <w:start w:val="single" w:sz="4" w:space="0" w:color="000000"/>
@@ -586,7 +586,7 @@
         </w:tc>
         <w:tc>
           <w:tcPr>
-            <w:tcW w:w="1701" w:type="dxa"/>
+            <w:tcW w:w="2200" w:type="dxa"/>
             <w:tcBorders>
               <w:top w:val="single" w:sz="4" w:space="0" w:color="000000"/>
               <w:start w:val="single" w:sz="4" w:space="0" w:color="000000"/>
@@ -611,7 +611,7 @@
               <w:rPr>
                 <w:rFonts w:ascii="Tahoma" w:hAnsi="Tahoma" w:cs="Tahoma"/>
                 <w:b w:val="0"/>
-                <w:sz w:val="22"/>
+                <w:sz w:val="18"/>
               </w:rPr>
               <w:t>SUMIMEDICAL</w:t>
             </w:r>
@@ -619,7 +619,7 @@
         </w:tc>
         <w:tc>
           <w:tcPr>
-            <w:tcW w:w="2410" w:type="dxa"/>
+            <w:tcW w:w="2079" w:type="dxa"/>
             <w:tcBorders>
               <w:top w:val="single" w:sz="4" w:space="0" w:color="000000"/>
               <w:start w:val="single" w:sz="4" w:space="0" w:color="000000"/>
@@ -689,7 +689,7 @@
         </w:tc>
         <w:tc>
           <w:tcPr>
-            <w:tcW w:w="2268" w:type="dxa"/>
+            <w:tcW w:w="2100" w:type="dxa"/>
             <w:tcBorders>
               <w:top w:val="single" w:sz="4" w:space="0" w:color="000000"/>
               <w:start w:val="single" w:sz="4" w:space="0" w:color="000000"/>
@@ -722,7 +722,7 @@
         </w:tc>
         <w:tc>
           <w:tcPr>
-            <w:tcW w:w="1701" w:type="dxa"/>
+            <w:tcW w:w="2200" w:type="dxa"/>
             <w:tcBorders>
               <w:top w:val="single" w:sz="4" w:space="0" w:color="000000"/>
               <w:start w:val="single" w:sz="4" w:space="0" w:color="000000"/>
@@ -747,7 +747,7 @@
               <w:rPr>
                 <w:rFonts w:ascii="Tahoma" w:hAnsi="Tahoma" w:cs="Tahoma"/>
                 <w:b w:val="0"/>
-                <w:sz w:val="22"/>
+                <w:sz w:val="18"/>
               </w:rPr>
               <w:t>SUMIMEDICAL</w:t>
             </w:r>
@@ -755,7 +755,7 @@
         </w:tc>
         <w:tc>
           <w:tcPr>
-            <w:tcW w:w="2410" w:type="dxa"/>
+            <w:tcW w:w="2079" w:type="dxa"/>
             <w:tcBorders>
               <w:top w:val="single" w:sz="4" w:space="0" w:color="000000"/>
               <w:start w:val="single" w:sz="4" w:space="0" w:color="000000"/>
@@ -825,7 +825,7 @@
         </w:tc>
         <w:tc>
           <w:tcPr>
-            <w:tcW w:w="2268" w:type="dxa"/>
+            <w:tcW w:w="2100" w:type="dxa"/>
             <w:tcBorders>
               <w:top w:val="single" w:sz="4" w:space="0" w:color="000000"/>
               <w:start w:val="single" w:sz="4" w:space="0" w:color="000000"/>
@@ -858,7 +858,7 @@
         </w:tc>
         <w:tc>
           <w:tcPr>
-            <w:tcW w:w="1701" w:type="dxa"/>
+            <w:tcW w:w="2200" w:type="dxa"/>
             <w:tcBorders>
               <w:top w:val="single" w:sz="4" w:space="0" w:color="000000"/>
               <w:start w:val="single" w:sz="4" w:space="0" w:color="000000"/>
@@ -891,7 +891,7 @@
         </w:tc>
         <w:tc>
           <w:tcPr>
-            <w:tcW w:w="2410" w:type="dxa"/>
+            <w:tcW w:w="2079" w:type="dxa"/>
             <w:tcBorders>
               <w:top w:val="single" w:sz="4" w:space="0" w:color="000000"/>
               <w:start w:val="single" w:sz="4" w:space="0" w:color="000000"/>
@@ -962,7 +962,7 @@
         </w:tc>
         <w:tc>
           <w:tcPr>
-            <w:tcW w:w="2268" w:type="dxa"/>
+            <w:tcW w:w="2100" w:type="dxa"/>
             <w:tcBorders>
               <w:top w:val="single" w:sz="4" w:space="0" w:color="000000"/>
               <w:start w:val="single" w:sz="4" w:space="0" w:color="000000"/>
@@ -995,7 +995,7 @@
         </w:tc>
         <w:tc>
           <w:tcPr>
-            <w:tcW w:w="1701" w:type="dxa"/>
+            <w:tcW w:w="2200" w:type="dxa"/>
             <w:tcBorders>
               <w:top w:val="single" w:sz="4" w:space="0" w:color="000000"/>
               <w:start w:val="single" w:sz="4" w:space="0" w:color="000000"/>
@@ -1028,7 +1028,7 @@
         </w:tc>
         <w:tc>
           <w:tcPr>
-            <w:tcW w:w="2410" w:type="dxa"/>
+            <w:tcW w:w="2079" w:type="dxa"/>
             <w:tcBorders>
               <w:top w:val="single" w:sz="4" w:space="0" w:color="000000"/>
               <w:start w:val="single" w:sz="4" w:space="0" w:color="000000"/>
@@ -1146,7 +1146,7 @@
         </w:tc>
         <w:tc>
           <w:tcPr>
-            <w:tcW w:w="2268" w:type="dxa"/>
+            <w:tcW w:w="2100" w:type="dxa"/>
             <w:tcBorders>
               <w:top w:val="single" w:sz="4" w:space="0" w:color="000000"/>
               <w:start w:val="single" w:sz="4" w:space="0" w:color="000000"/>
@@ -1179,7 +1179,7 @@
         </w:tc>
         <w:tc>
           <w:tcPr>
-            <w:tcW w:w="1701" w:type="dxa"/>
+            <w:tcW w:w="2200" w:type="dxa"/>
             <w:tcBorders>
               <w:top w:val="single" w:sz="4" w:space="0" w:color="000000"/>
               <w:start w:val="single" w:sz="4" w:space="0" w:color="000000"/>
@@ -1212,7 +1212,7 @@
         </w:tc>
         <w:tc>
           <w:tcPr>
-            <w:tcW w:w="2410" w:type="dxa"/>
+            <w:tcW w:w="2079" w:type="dxa"/>
             <w:tcBorders>
               <w:top w:val="single" w:sz="4" w:space="0" w:color="000000"/>
               <w:start w:val="single" w:sz="4" w:space="0" w:color="000000"/>
@@ -1283,7 +1283,7 @@
         </w:tc>
         <w:tc>
           <w:tcPr>
-            <w:tcW w:w="2268" w:type="dxa"/>
+            <w:tcW w:w="2100" w:type="dxa"/>
             <w:tcBorders>
               <w:top w:val="single" w:sz="4" w:space="0" w:color="000000"/>
               <w:start w:val="single" w:sz="4" w:space="0" w:color="000000"/>
@@ -1316,7 +1316,7 @@
         </w:tc>
         <w:tc>
           <w:tcPr>
-            <w:tcW w:w="1701" w:type="dxa"/>
+            <w:tcW w:w="2200" w:type="dxa"/>
             <w:tcBorders>
               <w:top w:val="single" w:sz="4" w:space="0" w:color="000000"/>
               <w:start w:val="single" w:sz="4" w:space="0" w:color="000000"/>
@@ -1349,7 +1349,7 @@
         </w:tc>
         <w:tc>
           <w:tcPr>
-            <w:tcW w:w="2410" w:type="dxa"/>
+            <w:tcW w:w="2079" w:type="dxa"/>
             <w:tcBorders>
               <w:top w:val="single" w:sz="4" w:space="0" w:color="000000"/>
               <w:start w:val="single" w:sz="4" w:space="0" w:color="000000"/>

</xml_diff>